<commit_message>
Update author order and renumber affiliations
Reorder authors to: Quang-Vinh Dang, Hoang-Viet Vu, Ngoc-Son-An Nguyen,
Minh Ngoc Dinh, and Dat Le (corresponding), renumbering affiliation
superscripts to match.

Co-Authored-By: Claude Opus 4.8 <noreply@anthropic.com>
Claude-Session: https://claude.ai/code/session_01PbhnFpMyn9oS2om5g4tQk2
</commit_message>
<xml_diff>
--- a/manuscripts/CAPS_camera_ready.docx
+++ b/manuscripts/CAPS_camera_ready.docx
@@ -362,7 +362,16 @@
         <w:t>1</w:t>
       </w:r>
       <w:r>
-        <w:t>, Minh Ngoc Dinh</w:t>
+        <w:t>, Hoang-Viet Vu</w:t>
+      </w:r>
+      <w:r>
+        <w:rPr>
+          <w:vertAlign w:val="superscript"/>
+        </w:rPr>
+        <w:t>1</w:t>
+      </w:r>
+      <w:r>
+        <w:t>, Ngoc-Son-An Nguyen</w:t>
       </w:r>
       <w:r>
         <w:rPr>
@@ -371,37 +380,28 @@
         <w:t>2</w:t>
       </w:r>
       <w:r>
-        <w:t>, Dat Le</w:t>
+        <w:t>, Minh Ngoc Dinh</w:t>
       </w:r>
       <w:r>
         <w:rPr>
           <w:vertAlign w:val="superscript"/>
         </w:rPr>
-        <w:t>3,</w:t>
+        <w:t>3</w:t>
+      </w:r>
+      <w:r>
+        <w:t xml:space="preserve"> and Dat Le</w:t>
+      </w:r>
+      <w:r>
+        <w:rPr>
+          <w:vertAlign w:val="superscript"/>
+        </w:rPr>
+        <w:t>4,</w:t>
       </w:r>
       <w:r>
         <w:rPr>
           <w:vertAlign w:val="superscript"/>
         </w:rPr>
         <w:t>*</w:t>
-      </w:r>
-      <w:r>
-        <w:t>, Ngoc-Son-An Nguyen</w:t>
-      </w:r>
-      <w:r>
-        <w:rPr>
-          <w:vertAlign w:val="superscript"/>
-        </w:rPr>
-        <w:t>4</w:t>
-      </w:r>
-      <w:r>
-        <w:t xml:space="preserve"> and Hoang-Viet Vu</w:t>
-      </w:r>
-      <w:r>
-        <w:rPr>
-          <w:vertAlign w:val="superscript"/>
-        </w:rPr>
-        <w:t>1</w:t>
       </w:r>
     </w:p>
     <w:p>
@@ -437,7 +437,7 @@
         <w:t>2</w:t>
       </w:r>
       <w:r>
-        <w:t xml:space="preserve"> Millennia Education, Ho Chi Minh City, Vietnam, 84000</w:t>
+        <w:t xml:space="preserve"> Industrial University of Ho Chi Minh City, Ho Chi Minh City, Vietnam, 84000</w:t>
       </w:r>
     </w:p>
     <w:p>
@@ -457,7 +457,7 @@
         <w:t>3</w:t>
       </w:r>
       <w:r>
-        <w:t xml:space="preserve"> University of Economics and Finance, Ho Chi Minh City, Vietnam, 84000</w:t>
+        <w:t xml:space="preserve"> Millennia Education, Ho Chi Minh City, Vietnam, 84000</w:t>
       </w:r>
     </w:p>
     <w:p>
@@ -477,7 +477,7 @@
         <w:t>4</w:t>
       </w:r>
       <w:r>
-        <w:t xml:space="preserve"> Industrial University of Ho Chi Minh City, Ho Chi Minh City, Vietnam, 84000</w:t>
+        <w:t xml:space="preserve"> University of Economics and Finance, Ho Chi Minh City, Vietnam, 84000</w:t>
       </w:r>
     </w:p>
     <w:p>

</xml_diff>